<commit_message>
Actualiza formatos de Ingenieria Civil e Industrial
</commit_message>
<xml_diff>
--- a/Carreras/Ingenierìa Industrial/formato.docx
+++ b/Carreras/Ingenierìa Industrial/formato.docx
@@ -8282,6 +8282,7 @@
             <w:pPr>
               <w:jc w:val="center"/>
             </w:pPr>
+            <w:proofErr w:type="gramStart"/>
             <w:r>
               <w:rPr>
                 <w:rFonts w:ascii="Arial" w:eastAsia="Arial" w:hAnsi="Arial" w:cs="Arial"/>
@@ -8290,7 +8291,18 @@
                 <w:sz w:val="16"/>
                 <w:szCs w:val="16"/>
               </w:rPr>
-              <w:t xml:space="preserve">TOTAL DE CRÉDITOS A CONVALIDAR </w:t>
+              <w:t>TOTAL</w:t>
+            </w:r>
+            <w:proofErr w:type="gramEnd"/>
+            <w:r>
+              <w:rPr>
+                <w:rFonts w:ascii="Arial" w:eastAsia="Arial" w:hAnsi="Arial" w:cs="Arial"/>
+                <w:b/>
+                <w:bCs/>
+                <w:sz w:val="16"/>
+                <w:szCs w:val="16"/>
+              </w:rPr>
+              <w:t xml:space="preserve"> DE CRÉDITOS A CONVALIDAR </w:t>
             </w:r>
           </w:p>
         </w:tc>
@@ -9076,15 +9088,25 @@
           <w:sz w:val="20"/>
         </w:rPr>
       </w:pPr>
+    </w:p>
+    <w:p>
+      <w:pPr>
+        <w:spacing w:after="0"/>
+        <w:ind w:left="1559"/>
+        <w:jc w:val="center"/>
+        <w:rPr>
+          <w:sz w:val="20"/>
+        </w:rPr>
+      </w:pPr>
       <w:r>
         <w:rPr>
-          <w:noProof/>
+          <w:sz w:val="20"/>
         </w:rPr>
         <w:drawing>
-          <wp:inline distT="0" distB="0" distL="0" distR="0" wp14:anchorId="4A29F54F" wp14:editId="46B4AB8B">
-            <wp:extent cx="4320914" cy="1371719"/>
-            <wp:effectExtent l="0" t="0" r="3810" b="0"/>
-            <wp:docPr id="17" name="Imagen 17"/>
+          <wp:inline distT="0" distB="0" distL="0" distR="0" wp14:anchorId="3D3043E7" wp14:editId="7FA9D319">
+            <wp:extent cx="4229467" cy="1752752"/>
+            <wp:effectExtent l="0" t="0" r="0" b="0"/>
+            <wp:docPr id="9" name="Imagen 9"/>
             <wp:cNvGraphicFramePr>
               <a:graphicFrameLocks xmlns:a="http://schemas.openxmlformats.org/drawingml/2006/main" noChangeAspect="1"/>
             </wp:cNvGraphicFramePr>
@@ -9104,7 +9126,7 @@
                   <pic:spPr>
                     <a:xfrm>
                       <a:off x="0" y="0"/>
-                      <a:ext cx="4320914" cy="1371719"/>
+                      <a:ext cx="4229467" cy="1752752"/>
                     </a:xfrm>
                     <a:prstGeom prst="rect">
                       <a:avLst/>
@@ -9116,16 +9138,6 @@
           </wp:inline>
         </w:drawing>
       </w:r>
-    </w:p>
-    <w:p>
-      <w:pPr>
-        <w:spacing w:after="0"/>
-        <w:ind w:left="1559"/>
-        <w:jc w:val="center"/>
-        <w:rPr>
-          <w:sz w:val="20"/>
-        </w:rPr>
-      </w:pPr>
     </w:p>
     <w:p>
       <w:pPr>
@@ -16675,6 +16687,7 @@
                 <w:szCs w:val="16"/>
               </w:rPr>
             </w:pPr>
+            <w:proofErr w:type="gramStart"/>
             <w:r>
               <w:rPr>
                 <w:rFonts w:asciiTheme="minorHAnsi" w:eastAsia="Arial" w:hAnsiTheme="minorHAnsi" w:cstheme="minorHAnsi"/>
@@ -16682,7 +16695,17 @@
                 <w:sz w:val="16"/>
                 <w:szCs w:val="16"/>
               </w:rPr>
-              <w:t xml:space="preserve">TOTAL DE CREDITOS NO CONVALIDADOS </w:t>
+              <w:t>TOTAL</w:t>
+            </w:r>
+            <w:proofErr w:type="gramEnd"/>
+            <w:r>
+              <w:rPr>
+                <w:rFonts w:asciiTheme="minorHAnsi" w:eastAsia="Arial" w:hAnsiTheme="minorHAnsi" w:cstheme="minorHAnsi"/>
+                <w:b/>
+                <w:sz w:val="16"/>
+                <w:szCs w:val="16"/>
+              </w:rPr>
+              <w:t xml:space="preserve"> DE CREDITOS NO CONVALIDADOS </w:t>
             </w:r>
           </w:p>
         </w:tc>

</xml_diff>